<commit_message>
Finalized STA 3000, ai-related stock analysis, more research needs to be done
</commit_message>
<xml_diff>
--- a/docs/Detection_of_Excess_Returns_in_AI-Related_Stocks.docx
+++ b/docs/Detection_of_Excess_Returns_in_AI-Related_Stocks.docx
@@ -54,29 +54,34 @@
         <w:t xml:space="preserve">This project examines whether AI-related assets show statistically significant </w:t>
       </w:r>
       <w:r>
+        <w:t>positive excess returns</w:t>
+      </w:r>
+      <w:r>
+        <w:t xml:space="preserve"> after major AI-related events. In this project, “AI-related asset behavior” refers to changes in daily returns and excess returns before and after AI events.</w:t>
+      </w:r>
+    </w:p>
+    <w:p>
+      <w:pPr>
+        <w:ind w:firstLine="720"/>
+        <w:rPr>
+          <w:u w:val="single"/>
+        </w:rPr>
+      </w:pPr>
+      <w:r>
         <w:rPr>
           <w:b/>
           <w:bCs/>
+          <w:u w:val="single"/>
         </w:rPr>
-        <w:t>positive excess returns</w:t>
-      </w:r>
-      <w:r>
-        <w:t xml:space="preserve"> after major AI-related events. In this project, “AI-related asset behavior” refers to changes in daily returns and excess returns before and after AI events.</w:t>
-      </w:r>
-    </w:p>
-    <w:p>
-      <w:pPr>
-        <w:ind w:firstLine="720"/>
-      </w:pPr>
+        <w:t>Objective</w:t>
+      </w:r>
       <w:r>
         <w:rPr>
           <w:b/>
           <w:bCs/>
+          <w:u w:val="single"/>
         </w:rPr>
-        <w:t>Objectives</w:t>
-      </w:r>
-      <w:r>
-        <w:tab/>
+        <w:t>s:</w:t>
       </w:r>
     </w:p>
     <w:p>
@@ -184,35 +189,7 @@
           <w:b/>
           <w:bCs/>
         </w:rPr>
-        <w:t>after</w:t>
-      </w:r>
-      <w:r>
-        <w:rPr>
-          <w:b/>
-          <w:bCs/>
-        </w:rPr>
-        <w:t xml:space="preserve"> major A</w:t>
-      </w:r>
-      <w:r>
-        <w:rPr>
-          <w:b/>
-          <w:bCs/>
-        </w:rPr>
-        <w:t>I</w:t>
-      </w:r>
-      <w:r>
-        <w:rPr>
-          <w:b/>
-          <w:bCs/>
-        </w:rPr>
-        <w:t xml:space="preserve"> </w:t>
-      </w:r>
-      <w:r>
-        <w:rPr>
-          <w:b/>
-          <w:bCs/>
-        </w:rPr>
-        <w:t>events</w:t>
+        <w:t>the ChatGPT release</w:t>
       </w:r>
       <w:r>
         <w:rPr>
@@ -328,29 +305,28 @@
     </w:p>
     <w:p>
       <w:pPr>
-        <w:ind w:firstLine="360"/>
+        <w:ind w:firstLine="720"/>
         <w:rPr>
           <w:b/>
           <w:bCs/>
+          <w:u w:val="single"/>
         </w:rPr>
       </w:pPr>
       <w:r>
         <w:rPr>
           <w:b/>
           <w:bCs/>
+          <w:u w:val="single"/>
         </w:rPr>
         <w:t xml:space="preserve">Data Description: </w:t>
       </w:r>
     </w:p>
     <w:p>
-      <w:r>
-        <w:t>Daily stock price data w</w:t>
-      </w:r>
-      <w:r>
-        <w:t>ill be</w:t>
-      </w:r>
-      <w:r>
-        <w:t xml:space="preserve"> collected from Yahoo Finance using the tidyquant package in R.</w:t>
+      <w:pPr>
+        <w:ind w:firstLine="720"/>
+      </w:pPr>
+      <w:r>
+        <w:t>Daily stock price data will be collected from Yahoo Finance using the tidyquant package in R. The analysis will use adjusted closing prices to calculate daily log returns, market returns, excess returns, and a post-event indicator.</w:t>
       </w:r>
     </w:p>
     <w:p>
@@ -700,6 +676,7 @@
               <w:ind w:firstLine="720"/>
             </w:pPr>
             <w:r>
+              <w:lastRenderedPageBreak/>
               <w:t>META</w:t>
             </w:r>
           </w:p>
@@ -750,7 +727,6 @@
               <w:ind w:firstLine="720"/>
             </w:pPr>
             <w:r>
-              <w:lastRenderedPageBreak/>
               <w:t>MSFT</w:t>
             </w:r>
           </w:p>
@@ -840,11 +816,130 @@
     <w:p>
       <w:pPr>
         <w:ind w:firstLine="720"/>
-      </w:pPr>
-      <w:r>
-        <w:t>These companies are selected because they represent different types of AI exposure, including AI hardware, cloud services, platforms, advertising, consumer technology, and autonomous driving.</w:t>
+        <w:rPr>
+          <w:b/>
+          <w:bCs/>
+        </w:rPr>
+      </w:pPr>
+      <w:r>
+        <w:rPr>
+          <w:b/>
+          <w:bCs/>
+        </w:rPr>
+        <w:t>Benchmark:</w:t>
+      </w:r>
+      <w:r>
+        <w:rPr>
+          <w:b/>
+          <w:bCs/>
+        </w:rPr>
+        <w:tab/>
       </w:r>
     </w:p>
+    <w:tbl>
+      <w:tblPr>
+        <w:tblW w:w="0" w:type="auto"/>
+        <w:tblCellSpacing w:w="15" w:type="dxa"/>
+        <w:tblCellMar>
+          <w:top w:w="15" w:type="dxa"/>
+          <w:left w:w="15" w:type="dxa"/>
+          <w:bottom w:w="15" w:type="dxa"/>
+          <w:right w:w="15" w:type="dxa"/>
+        </w:tblCellMar>
+        <w:tblLook w:val="04A0" w:firstRow="1" w:lastRow="0" w:firstColumn="1" w:lastColumn="0" w:noHBand="0" w:noVBand="1"/>
+      </w:tblPr>
+      <w:tblGrid>
+        <w:gridCol w:w="1458"/>
+        <w:gridCol w:w="5323"/>
+      </w:tblGrid>
+      <w:tr>
+        <w:trPr>
+          <w:tblHeader/>
+          <w:tblCellSpacing w:w="15" w:type="dxa"/>
+        </w:trPr>
+        <w:tc>
+          <w:tcPr>
+            <w:tcW w:w="0" w:type="auto"/>
+            <w:vAlign w:val="center"/>
+            <w:hideMark/>
+          </w:tcPr>
+          <w:p>
+            <w:pPr>
+              <w:ind w:firstLine="720"/>
+              <w:rPr>
+                <w:b/>
+                <w:bCs/>
+              </w:rPr>
+            </w:pPr>
+            <w:r>
+              <w:rPr>
+                <w:b/>
+                <w:bCs/>
+              </w:rPr>
+              <w:t>Ticker</w:t>
+            </w:r>
+          </w:p>
+        </w:tc>
+        <w:tc>
+          <w:tcPr>
+            <w:tcW w:w="0" w:type="auto"/>
+            <w:vAlign w:val="center"/>
+            <w:hideMark/>
+          </w:tcPr>
+          <w:p>
+            <w:pPr>
+              <w:ind w:firstLine="720"/>
+              <w:rPr>
+                <w:b/>
+                <w:bCs/>
+              </w:rPr>
+            </w:pPr>
+            <w:r>
+              <w:rPr>
+                <w:b/>
+                <w:bCs/>
+              </w:rPr>
+              <w:t>Description</w:t>
+            </w:r>
+          </w:p>
+        </w:tc>
+      </w:tr>
+      <w:tr>
+        <w:trPr>
+          <w:tblCellSpacing w:w="15" w:type="dxa"/>
+        </w:trPr>
+        <w:tc>
+          <w:tcPr>
+            <w:tcW w:w="0" w:type="auto"/>
+            <w:vAlign w:val="center"/>
+            <w:hideMark/>
+          </w:tcPr>
+          <w:p>
+            <w:pPr>
+              <w:ind w:firstLine="720"/>
+            </w:pPr>
+            <w:r>
+              <w:t>SPY</w:t>
+            </w:r>
+          </w:p>
+        </w:tc>
+        <w:tc>
+          <w:tcPr>
+            <w:tcW w:w="0" w:type="auto"/>
+            <w:vAlign w:val="center"/>
+            <w:hideMark/>
+          </w:tcPr>
+          <w:p>
+            <w:pPr>
+              <w:ind w:firstLine="720"/>
+            </w:pPr>
+            <w:r>
+              <w:t>S&amp;P 500 ETF used as the market benchmark</w:t>
+            </w:r>
+          </w:p>
+        </w:tc>
+      </w:tr>
+    </w:tbl>
     <w:p>
       <w:pPr>
         <w:ind w:firstLine="720"/>
@@ -858,53 +953,7 @@
           <w:b/>
           <w:bCs/>
         </w:rPr>
-        <w:t>Benchmarks:</w:t>
-      </w:r>
-    </w:p>
-    <w:p>
-      <w:pPr>
-        <w:pStyle w:val="ListParagraph"/>
-        <w:numPr>
-          <w:ilvl w:val="0"/>
-          <w:numId w:val="15"/>
-        </w:numPr>
-        <w:ind w:left="1080"/>
-      </w:pPr>
-      <w:r>
-        <w:t>SPY</w:t>
-      </w:r>
-      <w:r>
-        <w:t xml:space="preserve"> (S&amp;P 500 ETF)</w:t>
-      </w:r>
-    </w:p>
-    <w:p>
-      <w:pPr>
-        <w:ind w:left="720"/>
-      </w:pPr>
-      <w:r>
-        <w:t xml:space="preserve">SPY will be used as the market benchmark because it represents overall market performance and provides consistent daily price </w:t>
-      </w:r>
-      <w:r>
-        <w:t>data</w:t>
-      </w:r>
-      <w:r>
-        <w:t>.</w:t>
-      </w:r>
-    </w:p>
-    <w:p>
-      <w:pPr>
-        <w:ind w:firstLine="720"/>
-        <w:rPr>
-          <w:b/>
-          <w:bCs/>
-        </w:rPr>
-      </w:pPr>
-      <w:r>
-        <w:rPr>
-          <w:b/>
-          <w:bCs/>
-        </w:rPr>
-        <w:t>Key events</w:t>
+        <w:t>Key event</w:t>
       </w:r>
       <w:r>
         <w:rPr>
@@ -918,7 +967,7 @@
           <w:b/>
           <w:bCs/>
         </w:rPr>
-        <w:t>AI Breakthroughs</w:t>
+        <w:t>AI Breakthrough</w:t>
       </w:r>
     </w:p>
     <w:p>
@@ -935,66 +984,38 @@
           <w:b/>
           <w:bCs/>
         </w:rPr>
-        <w:t>November 2022:</w:t>
-      </w:r>
-      <w:r>
-        <w:t xml:space="preserve"> Release of ChatGPT</w:t>
-      </w:r>
-    </w:p>
-    <w:p>
-      <w:pPr>
-        <w:pStyle w:val="ListParagraph"/>
-        <w:numPr>
-          <w:ilvl w:val="3"/>
-          <w:numId w:val="28"/>
-        </w:numPr>
-        <w:ind w:left="1080"/>
-      </w:pPr>
+        <w:t>November</w:t>
+      </w:r>
       <w:r>
         <w:rPr>
           <w:b/>
           <w:bCs/>
         </w:rPr>
-        <w:t>2023:</w:t>
-      </w:r>
-      <w:r>
         <w:t xml:space="preserve"> </w:t>
       </w:r>
-      <w:r>
-        <w:t>NVIDIA earnings announcements associated with AI growth</w:t>
-      </w:r>
-    </w:p>
-    <w:p>
-      <w:pPr>
-        <w:pStyle w:val="ListParagraph"/>
-        <w:numPr>
-          <w:ilvl w:val="3"/>
-          <w:numId w:val="28"/>
-        </w:numPr>
-        <w:ind w:left="1080"/>
-      </w:pPr>
       <w:r>
         <w:rPr>
           <w:b/>
           <w:bCs/>
         </w:rPr>
-        <w:t xml:space="preserve">April </w:t>
+        <w:t>30</w:t>
       </w:r>
       <w:r>
         <w:rPr>
           <w:b/>
           <w:bCs/>
         </w:rPr>
-        <w:t>2026:</w:t>
-      </w:r>
-      <w:r>
-        <w:t xml:space="preserve"> </w:t>
-      </w:r>
-      <w:r>
-        <w:t xml:space="preserve">Claude Mythos Preview </w:t>
-      </w:r>
-      <w:r>
-        <w:t>announcement</w:t>
+        <w:t>,</w:t>
+      </w:r>
+      <w:r>
+        <w:rPr>
+          <w:b/>
+          <w:bCs/>
+        </w:rPr>
+        <w:t xml:space="preserve"> 2022:</w:t>
+      </w:r>
+      <w:r>
+        <w:t xml:space="preserve"> Release of ChatGPT</w:t>
       </w:r>
     </w:p>
     <w:p>
@@ -1010,6 +1031,13 @@
           <w:b/>
           <w:bCs/>
         </w:rPr>
+        <w:t xml:space="preserve">Relevant </w:t>
+      </w:r>
+      <w:r>
+        <w:rPr>
+          <w:b/>
+          <w:bCs/>
+        </w:rPr>
         <w:t>Varia</w:t>
       </w:r>
       <w:r>
@@ -1019,177 +1047,524 @@
         </w:rPr>
         <w:t>bles</w:t>
       </w:r>
-    </w:p>
-    <w:p>
-      <w:pPr>
-        <w:ind w:firstLine="720"/>
-      </w:pPr>
-      <w:r>
-        <w:t>The project will use the following variables:</w:t>
-      </w:r>
-    </w:p>
-    <w:p>
-      <w:pPr>
-        <w:pStyle w:val="ListParagraph"/>
-        <w:numPr>
-          <w:ilvl w:val="3"/>
-          <w:numId w:val="28"/>
-        </w:numPr>
-        <w:ind w:left="1080"/>
-      </w:pPr>
       <w:r>
         <w:rPr>
           <w:b/>
           <w:bCs/>
         </w:rPr>
-        <w:t>Adjusted closing price:</w:t>
-      </w:r>
-      <w:r>
-        <w:t xml:space="preserve"> The closing price adjusted for stock splits and dividends.</w:t>
-      </w:r>
-    </w:p>
-    <w:p>
-      <w:pPr>
-        <w:pStyle w:val="ListParagraph"/>
-        <w:numPr>
-          <w:ilvl w:val="3"/>
-          <w:numId w:val="28"/>
-        </w:numPr>
-        <w:ind w:left="1080"/>
-      </w:pPr>
+        <w:t>:</w:t>
+      </w:r>
       <w:r>
         <w:rPr>
           <w:b/>
           <w:bCs/>
         </w:rPr>
-        <w:t>Daily returns:</w:t>
-      </w:r>
-      <w:r>
-        <w:t xml:space="preserve"> Log returns calculated from adjusted closing prices.</w:t>
-      </w:r>
+        <w:t xml:space="preserve">   </w:t>
+      </w:r>
+    </w:p>
+    <w:tbl>
+      <w:tblPr>
+        <w:tblW w:w="0" w:type="auto"/>
+        <w:tblCellSpacing w:w="15" w:type="dxa"/>
+        <w:tblCellMar>
+          <w:top w:w="15" w:type="dxa"/>
+          <w:left w:w="15" w:type="dxa"/>
+          <w:bottom w:w="15" w:type="dxa"/>
+          <w:right w:w="15" w:type="dxa"/>
+        </w:tblCellMar>
+        <w:tblLook w:val="04A0" w:firstRow="1" w:lastRow="0" w:firstColumn="1" w:lastColumn="0" w:noHBand="0" w:noVBand="1"/>
+      </w:tblPr>
+      <w:tblGrid>
+        <w:gridCol w:w="3330"/>
+        <w:gridCol w:w="2610"/>
+        <w:gridCol w:w="3420"/>
+      </w:tblGrid>
+      <w:tr>
+        <w:trPr>
+          <w:tblHeader/>
+          <w:tblCellSpacing w:w="15" w:type="dxa"/>
+        </w:trPr>
+        <w:tc>
+          <w:tcPr>
+            <w:tcW w:w="3285" w:type="dxa"/>
+            <w:vAlign w:val="center"/>
+            <w:hideMark/>
+          </w:tcPr>
+          <w:p>
+            <w:pPr>
+              <w:ind w:firstLine="720"/>
+              <w:rPr>
+                <w:b/>
+                <w:bCs/>
+              </w:rPr>
+            </w:pPr>
+            <w:r>
+              <w:rPr>
+                <w:b/>
+                <w:bCs/>
+              </w:rPr>
+              <w:t>Variable</w:t>
+            </w:r>
+          </w:p>
+        </w:tc>
+        <w:tc>
+          <w:tcPr>
+            <w:tcW w:w="2580" w:type="dxa"/>
+            <w:vAlign w:val="center"/>
+            <w:hideMark/>
+          </w:tcPr>
+          <w:p>
+            <w:pPr>
+              <w:ind w:firstLine="720"/>
+              <w:rPr>
+                <w:b/>
+                <w:bCs/>
+              </w:rPr>
+            </w:pPr>
+            <w:r>
+              <w:rPr>
+                <w:b/>
+                <w:bCs/>
+              </w:rPr>
+              <w:t>Type</w:t>
+            </w:r>
+          </w:p>
+        </w:tc>
+        <w:tc>
+          <w:tcPr>
+            <w:tcW w:w="3375" w:type="dxa"/>
+            <w:vAlign w:val="center"/>
+            <w:hideMark/>
+          </w:tcPr>
+          <w:p>
+            <w:pPr>
+              <w:ind w:firstLine="720"/>
+              <w:rPr>
+                <w:b/>
+                <w:bCs/>
+              </w:rPr>
+            </w:pPr>
+            <w:r>
+              <w:rPr>
+                <w:b/>
+                <w:bCs/>
+              </w:rPr>
+              <w:t>Description</w:t>
+            </w:r>
+          </w:p>
+        </w:tc>
+      </w:tr>
+      <w:tr>
+        <w:trPr>
+          <w:tblCellSpacing w:w="15" w:type="dxa"/>
+        </w:trPr>
+        <w:tc>
+          <w:tcPr>
+            <w:tcW w:w="3285" w:type="dxa"/>
+            <w:vAlign w:val="center"/>
+            <w:hideMark/>
+          </w:tcPr>
+          <w:p>
+            <w:pPr>
+              <w:ind w:firstLine="720"/>
+            </w:pPr>
+            <w:r>
+              <w:t>Date</w:t>
+            </w:r>
+          </w:p>
+        </w:tc>
+        <w:tc>
+          <w:tcPr>
+            <w:tcW w:w="2580" w:type="dxa"/>
+            <w:vAlign w:val="center"/>
+            <w:hideMark/>
+          </w:tcPr>
+          <w:p>
+            <w:pPr>
+              <w:ind w:firstLine="720"/>
+            </w:pPr>
+            <w:r>
+              <w:t>Date</w:t>
+            </w:r>
+          </w:p>
+        </w:tc>
+        <w:tc>
+          <w:tcPr>
+            <w:tcW w:w="3375" w:type="dxa"/>
+            <w:vAlign w:val="center"/>
+            <w:hideMark/>
+          </w:tcPr>
+          <w:p>
+            <w:r>
+              <w:t>Trading day for each stock or benchmark</w:t>
+            </w:r>
+          </w:p>
+        </w:tc>
+      </w:tr>
+      <w:tr>
+        <w:trPr>
+          <w:tblCellSpacing w:w="15" w:type="dxa"/>
+        </w:trPr>
+        <w:tc>
+          <w:tcPr>
+            <w:tcW w:w="3285" w:type="dxa"/>
+            <w:vAlign w:val="center"/>
+            <w:hideMark/>
+          </w:tcPr>
+          <w:p>
+            <w:pPr>
+              <w:ind w:firstLine="720"/>
+            </w:pPr>
+            <w:r>
+              <w:t>Symbol</w:t>
+            </w:r>
+          </w:p>
+        </w:tc>
+        <w:tc>
+          <w:tcPr>
+            <w:tcW w:w="2580" w:type="dxa"/>
+            <w:vAlign w:val="center"/>
+            <w:hideMark/>
+          </w:tcPr>
+          <w:p>
+            <w:pPr>
+              <w:ind w:firstLine="720"/>
+            </w:pPr>
+            <w:r>
+              <w:t>Categorical</w:t>
+            </w:r>
+          </w:p>
+        </w:tc>
+        <w:tc>
+          <w:tcPr>
+            <w:tcW w:w="3375" w:type="dxa"/>
+            <w:vAlign w:val="center"/>
+            <w:hideMark/>
+          </w:tcPr>
+          <w:p>
+            <w:r>
+              <w:t>Stock ticker, such as NVDA, MSFT, or SPY</w:t>
+            </w:r>
+          </w:p>
+        </w:tc>
+      </w:tr>
+      <w:tr>
+        <w:trPr>
+          <w:tblCellSpacing w:w="15" w:type="dxa"/>
+        </w:trPr>
+        <w:tc>
+          <w:tcPr>
+            <w:tcW w:w="3285" w:type="dxa"/>
+            <w:vAlign w:val="center"/>
+            <w:hideMark/>
+          </w:tcPr>
+          <w:p>
+            <w:pPr>
+              <w:ind w:firstLine="720"/>
+            </w:pPr>
+            <w:r>
+              <w:t>Adjusted price</w:t>
+            </w:r>
+          </w:p>
+        </w:tc>
+        <w:tc>
+          <w:tcPr>
+            <w:tcW w:w="2580" w:type="dxa"/>
+            <w:vAlign w:val="center"/>
+            <w:hideMark/>
+          </w:tcPr>
+          <w:p>
+            <w:pPr>
+              <w:ind w:firstLine="720"/>
+            </w:pPr>
+            <w:r>
+              <w:t>Numeric</w:t>
+            </w:r>
+          </w:p>
+        </w:tc>
+        <w:tc>
+          <w:tcPr>
+            <w:tcW w:w="3375" w:type="dxa"/>
+            <w:vAlign w:val="center"/>
+            <w:hideMark/>
+          </w:tcPr>
+          <w:p>
+            <w:r>
+              <w:t>Closing price adjusted for stock splits and dividends</w:t>
+            </w:r>
+          </w:p>
+        </w:tc>
+      </w:tr>
+      <w:tr>
+        <w:trPr>
+          <w:tblCellSpacing w:w="15" w:type="dxa"/>
+        </w:trPr>
+        <w:tc>
+          <w:tcPr>
+            <w:tcW w:w="3285" w:type="dxa"/>
+            <w:vAlign w:val="center"/>
+            <w:hideMark/>
+          </w:tcPr>
+          <w:p>
+            <w:pPr>
+              <w:ind w:firstLine="720"/>
+            </w:pPr>
+            <w:r>
+              <w:t>Daily return</w:t>
+            </w:r>
+          </w:p>
+        </w:tc>
+        <w:tc>
+          <w:tcPr>
+            <w:tcW w:w="2580" w:type="dxa"/>
+            <w:vAlign w:val="center"/>
+            <w:hideMark/>
+          </w:tcPr>
+          <w:p>
+            <w:pPr>
+              <w:ind w:firstLine="720"/>
+            </w:pPr>
+            <w:r>
+              <w:t>Numeric</w:t>
+            </w:r>
+          </w:p>
+        </w:tc>
+        <w:tc>
+          <w:tcPr>
+            <w:tcW w:w="3375" w:type="dxa"/>
+            <w:vAlign w:val="center"/>
+            <w:hideMark/>
+          </w:tcPr>
+          <w:p>
+            <w:r>
+              <w:t>Log return calculated from adjusted prices</w:t>
+            </w:r>
+          </w:p>
+        </w:tc>
+      </w:tr>
+      <w:tr>
+        <w:trPr>
+          <w:tblCellSpacing w:w="15" w:type="dxa"/>
+        </w:trPr>
+        <w:tc>
+          <w:tcPr>
+            <w:tcW w:w="3285" w:type="dxa"/>
+            <w:vAlign w:val="center"/>
+            <w:hideMark/>
+          </w:tcPr>
+          <w:p>
+            <w:pPr>
+              <w:ind w:firstLine="720"/>
+            </w:pPr>
+            <w:r>
+              <w:t>Market return</w:t>
+            </w:r>
+          </w:p>
+        </w:tc>
+        <w:tc>
+          <w:tcPr>
+            <w:tcW w:w="2580" w:type="dxa"/>
+            <w:vAlign w:val="center"/>
+            <w:hideMark/>
+          </w:tcPr>
+          <w:p>
+            <w:pPr>
+              <w:ind w:firstLine="720"/>
+            </w:pPr>
+            <w:r>
+              <w:t>Numeric</w:t>
+            </w:r>
+          </w:p>
+        </w:tc>
+        <w:tc>
+          <w:tcPr>
+            <w:tcW w:w="3375" w:type="dxa"/>
+            <w:vAlign w:val="center"/>
+            <w:hideMark/>
+          </w:tcPr>
+          <w:p>
+            <w:r>
+              <w:t>Daily log return of SPY</w:t>
+            </w:r>
+          </w:p>
+        </w:tc>
+      </w:tr>
+      <w:tr>
+        <w:trPr>
+          <w:tblCellSpacing w:w="15" w:type="dxa"/>
+        </w:trPr>
+        <w:tc>
+          <w:tcPr>
+            <w:tcW w:w="3285" w:type="dxa"/>
+            <w:vAlign w:val="center"/>
+            <w:hideMark/>
+          </w:tcPr>
+          <w:p>
+            <w:pPr>
+              <w:ind w:firstLine="720"/>
+            </w:pPr>
+            <w:r>
+              <w:t>Excess return</w:t>
+            </w:r>
+          </w:p>
+        </w:tc>
+        <w:tc>
+          <w:tcPr>
+            <w:tcW w:w="2580" w:type="dxa"/>
+            <w:vAlign w:val="center"/>
+            <w:hideMark/>
+          </w:tcPr>
+          <w:p>
+            <w:pPr>
+              <w:ind w:firstLine="720"/>
+            </w:pPr>
+            <w:r>
+              <w:t>Numeric</w:t>
+            </w:r>
+          </w:p>
+        </w:tc>
+        <w:tc>
+          <w:tcPr>
+            <w:tcW w:w="3375" w:type="dxa"/>
+            <w:vAlign w:val="center"/>
+            <w:hideMark/>
+          </w:tcPr>
+          <w:p>
+            <w:r>
+              <w:t>Stock return minus SPY return</w:t>
+            </w:r>
+          </w:p>
+        </w:tc>
+      </w:tr>
+      <w:tr>
+        <w:trPr>
+          <w:tblCellSpacing w:w="15" w:type="dxa"/>
+        </w:trPr>
+        <w:tc>
+          <w:tcPr>
+            <w:tcW w:w="3285" w:type="dxa"/>
+            <w:vAlign w:val="center"/>
+            <w:hideMark/>
+          </w:tcPr>
+          <w:p>
+            <w:pPr>
+              <w:ind w:firstLine="720"/>
+            </w:pPr>
+            <w:r>
+              <w:t>Post-event indicator</w:t>
+            </w:r>
+          </w:p>
+        </w:tc>
+        <w:tc>
+          <w:tcPr>
+            <w:tcW w:w="2580" w:type="dxa"/>
+            <w:vAlign w:val="center"/>
+            <w:hideMark/>
+          </w:tcPr>
+          <w:p>
+            <w:pPr>
+              <w:ind w:firstLine="720"/>
+            </w:pPr>
+            <w:r>
+              <w:t>Binary</w:t>
+            </w:r>
+          </w:p>
+        </w:tc>
+        <w:tc>
+          <w:tcPr>
+            <w:tcW w:w="3375" w:type="dxa"/>
+            <w:vAlign w:val="center"/>
+            <w:hideMark/>
+          </w:tcPr>
+          <w:p>
+            <w:r>
+              <w:t>Equals 1 after the AI event and 0 before the AI event</w:t>
+            </w:r>
+          </w:p>
+        </w:tc>
+      </w:tr>
+    </w:tbl>
+    <w:p>
+      <w:pPr>
+        <w:ind w:firstLine="720"/>
+        <w:rPr>
+          <w:b/>
+          <w:bCs/>
+          <w:u w:val="single"/>
+        </w:rPr>
+      </w:pPr>
     </w:p>
     <w:p>
       <w:pPr>
-        <w:pStyle w:val="ListParagraph"/>
-        <w:numPr>
-          <w:ilvl w:val="3"/>
-          <w:numId w:val="28"/>
-        </w:numPr>
-        <w:ind w:left="1080"/>
-      </w:pPr>
+        <w:ind w:firstLine="720"/>
+        <w:rPr>
+          <w:b/>
+          <w:bCs/>
+          <w:u w:val="single"/>
+        </w:rPr>
+      </w:pPr>
+      <w:r>
+        <w:rPr>
+          <w:b/>
+          <w:bCs/>
+          <w:u w:val="single"/>
+        </w:rPr>
+        <w:t>Methodology</w:t>
+      </w:r>
+      <w:r>
+        <w:rPr>
+          <w:b/>
+          <w:bCs/>
+          <w:u w:val="single"/>
+        </w:rPr>
+        <w:t>:</w:t>
+      </w:r>
+    </w:p>
+    <w:p>
+      <w:pPr>
+        <w:ind w:firstLine="360"/>
+      </w:pPr>
+      <w:r>
+        <w:lastRenderedPageBreak/>
+        <w:t xml:space="preserve">The analysis will focus on a </w:t>
+      </w:r>
       <w:r>
         <w:rPr>
           <w:b/>
           <w:bCs/>
         </w:rPr>
-        <w:t>Market return:</w:t>
-      </w:r>
-      <w:r>
-        <w:t xml:space="preserve"> Daily return of SPY. </w:t>
+        <w:t>[-10, +10] trading-day event window</w:t>
+      </w:r>
+      <w:r>
+        <w:t xml:space="preserve"> around each major AI-related event.</w:t>
       </w:r>
     </w:p>
     <w:p>
       <w:pPr>
-        <w:pStyle w:val="ListParagraph"/>
-        <w:numPr>
-          <w:ilvl w:val="3"/>
-          <w:numId w:val="28"/>
-        </w:numPr>
-        <w:ind w:left="1080"/>
-      </w:pPr>
-      <w:r>
-        <w:rPr>
-          <w:b/>
-          <w:bCs/>
-        </w:rPr>
-        <w:t>Excess return:</w:t>
-      </w:r>
-      <w:r>
-        <w:t xml:space="preserve"> Stock return minus SPY return. </w:t>
+        <w:ind w:firstLine="360"/>
+      </w:pPr>
+      <w:r>
+        <w:t xml:space="preserve">First, visualizations will be used to examine stock price trends and excess return patterns. Then, descriptive statistics such as mean and standard deviation will </w:t>
+      </w:r>
+      <w:r>
+        <w:t>be compared</w:t>
+      </w:r>
+      <w:r>
+        <w:t xml:space="preserve"> </w:t>
+      </w:r>
+      <w:r>
+        <w:t xml:space="preserve">between </w:t>
+      </w:r>
+      <w:r>
+        <w:t>pre-event and post-event excess returns.</w:t>
       </w:r>
     </w:p>
     <w:p>
       <w:pPr>
-        <w:pStyle w:val="ListParagraph"/>
-        <w:numPr>
-          <w:ilvl w:val="3"/>
-          <w:numId w:val="28"/>
-        </w:numPr>
-        <w:ind w:left="1080"/>
-      </w:pPr>
-      <w:r>
-        <w:rPr>
-          <w:b/>
-          <w:bCs/>
-        </w:rPr>
-        <w:t>Post-event indicator:</w:t>
-      </w:r>
-      <w:r>
-        <w:t xml:space="preserve"> A binary variable equal to 1 after the AI event and 0 before the event. </w:t>
-      </w:r>
-    </w:p>
-    <w:p>
-      <w:pPr>
-        <w:ind w:firstLine="720"/>
-        <w:rPr>
-          <w:b/>
-          <w:bCs/>
-        </w:rPr>
-      </w:pPr>
-      <w:r>
-        <w:rPr>
-          <w:b/>
-          <w:bCs/>
-        </w:rPr>
-        <w:t>Methodology</w:t>
-      </w:r>
-    </w:p>
-    <w:p>
-      <w:pPr>
         <w:ind w:firstLine="360"/>
       </w:pPr>
       <w:r>
-        <w:t xml:space="preserve">The analysis will focus on a </w:t>
-      </w:r>
-      <w:r>
-        <w:t>[</w:t>
-      </w:r>
-      <w:r>
-        <w:t>-10, +10] trading-day event</w:t>
-      </w:r>
-      <w:r>
-        <w:t xml:space="preserve"> window </w:t>
-      </w:r>
-      <w:r>
-        <w:t xml:space="preserve">around </w:t>
-      </w:r>
-      <w:r>
-        <w:t>each major AI-related event.</w:t>
-      </w:r>
-    </w:p>
-    <w:p>
-      <w:pPr>
-        <w:ind w:firstLine="360"/>
-      </w:pPr>
-      <w:r>
-        <w:t>First, visualizations will be used to examine stock price trends and excess return patterns before and after each event.</w:t>
-      </w:r>
-    </w:p>
-    <w:p>
-      <w:pPr>
-        <w:ind w:firstLine="360"/>
-      </w:pPr>
-      <w:r>
-        <w:t>Second, descriptive statistics such as mean and standard deviation will be calculated to compare pre-event and post-event excess returns.</w:t>
-      </w:r>
-    </w:p>
-    <w:p>
-      <w:pPr>
-        <w:ind w:firstLine="360"/>
-      </w:pPr>
-      <w:r>
-        <w:lastRenderedPageBreak/>
-        <w:t>Third, excess returns will be calculated as:</w:t>
+        <w:t>Excess returns will be calculated as:</w:t>
       </w:r>
     </w:p>
     <w:p>
@@ -1209,15 +1584,7 @@
         <w:ind w:firstLine="360"/>
       </w:pPr>
       <w:r>
-        <w:t>Fourth, a t-test will be used to test whether the average post-event excess return is statistically greater than zero.</w:t>
-      </w:r>
-    </w:p>
-    <w:p>
-      <w:pPr>
-        <w:ind w:firstLine="360"/>
-      </w:pPr>
-      <w:r>
-        <w:t xml:space="preserve">Finally, a linear regression model will be used to </w:t>
+        <w:t xml:space="preserve">A t-test will test whether the average post-event excess return is statistically greater than zero. A linear regression model will also be used to </w:t>
       </w:r>
       <w:r>
         <w:t>control</w:t>
@@ -1235,42 +1602,7 @@
           <w:b/>
           <w:bCs/>
         </w:rPr>
-        <w:t>Stock Return = β₀ + β₁SPY Return + β₂</w:t>
-      </w:r>
-      <w:r>
-        <w:rPr>
-          <w:b/>
-          <w:bCs/>
-        </w:rPr>
-        <w:t>P</w:t>
-      </w:r>
-      <w:r>
-        <w:rPr>
-          <w:b/>
-          <w:bCs/>
-        </w:rPr>
-        <w:t>ost-</w:t>
-      </w:r>
-      <w:r>
-        <w:rPr>
-          <w:b/>
-          <w:bCs/>
-        </w:rPr>
-        <w:t>E</w:t>
-      </w:r>
-      <w:r>
-        <w:rPr>
-          <w:b/>
-          <w:bCs/>
-        </w:rPr>
-        <w:t>vent</w:t>
-      </w:r>
-      <w:r>
-        <w:rPr>
-          <w:b/>
-          <w:bCs/>
-        </w:rPr>
-        <w:t xml:space="preserve"> + ε</w:t>
+        <w:t>Stock Return = β₀ + β₁SPY Return + β₂Post-Event + ε</w:t>
       </w:r>
     </w:p>
     <w:p>
@@ -1288,13 +1620,15 @@
         <w:t>β₂</w:t>
       </w:r>
       <w:r>
-        <w:t xml:space="preserve"> measures whether stock returns were higher after the AI event, controlling for </w:t>
-      </w:r>
-      <w:r>
-        <w:t>overall</w:t>
-      </w:r>
-      <w:r>
-        <w:t xml:space="preserve"> market performance.</w:t>
+        <w:t xml:space="preserve"> measures whether stock returns were higher after the AI event, controlling for overall market performance.</w:t>
+      </w:r>
+    </w:p>
+    <w:p>
+      <w:pPr>
+        <w:ind w:firstLine="360"/>
+      </w:pPr>
+      <w:r>
+        <w:t>Overall, the project will use data visualization, descriptive statistics, excess return calculations, t-tests, and linear regression to evaluate whether AI-related stocks show abnormal financial performance after major AI events.</w:t>
       </w:r>
     </w:p>
     <w:p>
@@ -1407,96 +1741,15 @@
           <w:bCs/>
           <w:u w:val="single"/>
         </w:rPr>
-        <w:t>Methods:</w:t>
-      </w:r>
-    </w:p>
-    <w:p>
-      <w:pPr>
-        <w:ind w:firstLine="360"/>
-      </w:pPr>
-      <w:r>
-        <w:t>The project will use:</w:t>
-      </w:r>
-    </w:p>
-    <w:p>
-      <w:pPr>
-        <w:pStyle w:val="ListParagraph"/>
-        <w:numPr>
-          <w:ilvl w:val="3"/>
-          <w:numId w:val="28"/>
-        </w:numPr>
-        <w:ind w:left="1080"/>
-      </w:pPr>
-      <w:r>
-        <w:t xml:space="preserve">Data visualization </w:t>
-      </w:r>
-    </w:p>
-    <w:p>
-      <w:pPr>
-        <w:pStyle w:val="ListParagraph"/>
-        <w:numPr>
-          <w:ilvl w:val="3"/>
-          <w:numId w:val="28"/>
-        </w:numPr>
-        <w:ind w:left="1080"/>
-      </w:pPr>
-      <w:r>
-        <w:t xml:space="preserve">Descriptive statistics </w:t>
-      </w:r>
-    </w:p>
-    <w:p>
-      <w:pPr>
-        <w:pStyle w:val="ListParagraph"/>
-        <w:numPr>
-          <w:ilvl w:val="3"/>
-          <w:numId w:val="28"/>
-        </w:numPr>
-        <w:ind w:left="1080"/>
-      </w:pPr>
-      <w:r>
-        <w:t xml:space="preserve">Excess return calculations </w:t>
-      </w:r>
-    </w:p>
-    <w:p>
-      <w:pPr>
-        <w:pStyle w:val="ListParagraph"/>
-        <w:numPr>
-          <w:ilvl w:val="3"/>
-          <w:numId w:val="28"/>
-        </w:numPr>
-        <w:ind w:left="1080"/>
-      </w:pPr>
-      <w:r>
-        <w:t xml:space="preserve">T-tests </w:t>
-      </w:r>
-    </w:p>
-    <w:p>
-      <w:pPr>
-        <w:pStyle w:val="ListParagraph"/>
-        <w:numPr>
-          <w:ilvl w:val="3"/>
-          <w:numId w:val="28"/>
-        </w:numPr>
-        <w:ind w:left="1080"/>
-      </w:pPr>
-      <w:r>
-        <w:t>Linear regression</w:t>
-      </w:r>
-    </w:p>
-    <w:p>
-      <w:pPr>
-        <w:ind w:firstLine="360"/>
+        <w:t>Conclusion</w:t>
+      </w:r>
+      <w:r>
         <w:rPr>
           <w:b/>
           <w:bCs/>
+          <w:u w:val="single"/>
         </w:rPr>
-      </w:pPr>
-      <w:r>
-        <w:rPr>
-          <w:b/>
-          <w:bCs/>
-        </w:rPr>
-        <w:t>Conclusion</w:t>
+        <w:t>:</w:t>
       </w:r>
     </w:p>
     <w:p>
@@ -5940,6 +6193,7 @@
   <w:style w:type="character" w:default="1" w:styleId="DefaultParagraphFont">
     <w:name w:val="Default Paragraph Font"/>
     <w:uiPriority w:val="1"/>
+    <w:semiHidden/>
     <w:unhideWhenUsed/>
   </w:style>
   <w:style w:type="table" w:default="1" w:styleId="TableNormal">

</xml_diff>